<commit_message>
Re-render after stability cut-off fix
</commit_message>
<xml_diff>
--- a/output/archive/WestravelleData/Stability/QP07/WA-2025-407/Deviation_Notes/Hold/WA-2025-407_QP07_HOLD_NOTE_Rev01.docx
+++ b/output/archive/WestravelleData/Stability/QP07/WA-2025-407/Deviation_Notes/Hold/WA-2025-407_QP07_HOLD_NOTE_Rev01.docx
@@ -424,396 +424,6 @@
               <w:rPr>
                 <w:sz w:val="16"/>
               </w:rPr>
-              <w:t>25 °C/60% RH</w:t>
-            </w:r>
-          </w:p>
-        </w:tc>
-        <w:tc>
-          <w:tcPr>
-            <w:tcW w:type="dxa" w:w="1176"/>
-          </w:tcPr>
-          <w:p>
-            <w:pPr>
-              <w:keepNext/>
-            </w:pPr>
-            <w:r>
-              <w:rPr>
-                <w:sz w:val="16"/>
-              </w:rPr>
-              <w:t>1</w:t>
-            </w:r>
-          </w:p>
-        </w:tc>
-        <w:tc>
-          <w:tcPr>
-            <w:tcW w:type="dxa" w:w="1176"/>
-          </w:tcPr>
-          <w:p>
-            <w:pPr>
-              <w:keepNext/>
-            </w:pPr>
-            <w:r>
-              <w:rPr>
-                <w:sz w:val="16"/>
-              </w:rPr>
-              <w:t>98.9</w:t>
-            </w:r>
-          </w:p>
-        </w:tc>
-        <w:tc>
-          <w:tcPr>
-            <w:tcW w:type="dxa" w:w="1176"/>
-          </w:tcPr>
-          <w:p>
-            <w:pPr>
-              <w:keepNext/>
-            </w:pPr>
-            <w:r>
-              <w:rPr>
-                <w:sz w:val="16"/>
-              </w:rPr>
-              <w:t>0.08</w:t>
-            </w:r>
-          </w:p>
-        </w:tc>
-        <w:tc>
-          <w:tcPr>
-            <w:tcW w:type="dxa" w:w="1176"/>
-          </w:tcPr>
-          <w:p>
-            <w:pPr>
-              <w:keepNext/>
-            </w:pPr>
-            <w:r>
-              <w:rPr>
-                <w:sz w:val="16"/>
-              </w:rPr>
-              <w:t>&lt;0.05</w:t>
-            </w:r>
-          </w:p>
-        </w:tc>
-        <w:tc>
-          <w:tcPr>
-            <w:tcW w:type="dxa" w:w="1176"/>
-          </w:tcPr>
-          <w:p>
-            <w:pPr>
-              <w:keepNext/>
-            </w:pPr>
-            <w:r>
-              <w:rPr>
-                <w:sz w:val="16"/>
-              </w:rPr>
-              <w:t>0.22</w:t>
-            </w:r>
-          </w:p>
-        </w:tc>
-        <w:tc>
-          <w:tcPr>
-            <w:tcW w:type="dxa" w:w="1176"/>
-          </w:tcPr>
-          <w:p>
-            <w:pPr>
-              <w:keepNext/>
-            </w:pPr>
-            <w:r>
-              <w:rPr>
-                <w:sz w:val="16"/>
-              </w:rPr>
-              <w:t>2.3</w:t>
-            </w:r>
-          </w:p>
-        </w:tc>
-        <w:tc>
-          <w:tcPr>
-            <w:tcW w:type="dxa" w:w="1176"/>
-          </w:tcPr>
-          <w:p>
-            <w:pPr>
-              <w:keepNext/>
-            </w:pPr>
-            <w:r>
-              <w:rPr>
-                <w:sz w:val="16"/>
-              </w:rPr>
-              <w:t>Complies</w:t>
-            </w:r>
-          </w:p>
-        </w:tc>
-      </w:tr>
-      <w:tr>
-        <w:tc>
-          <w:tcPr>
-            <w:tcW w:type="dxa" w:w="1176"/>
-          </w:tcPr>
-          <w:p>
-            <w:pPr>
-              <w:keepNext/>
-            </w:pPr>
-            <w:r>
-              <w:rPr>
-                <w:sz w:val="16"/>
-              </w:rPr>
-              <w:t>25 °C/60% RH</w:t>
-            </w:r>
-          </w:p>
-        </w:tc>
-        <w:tc>
-          <w:tcPr>
-            <w:tcW w:type="dxa" w:w="1176"/>
-          </w:tcPr>
-          <w:p>
-            <w:pPr>
-              <w:keepNext/>
-            </w:pPr>
-            <w:r>
-              <w:rPr>
-                <w:sz w:val="16"/>
-              </w:rPr>
-              <w:t>3</w:t>
-            </w:r>
-          </w:p>
-        </w:tc>
-        <w:tc>
-          <w:tcPr>
-            <w:tcW w:type="dxa" w:w="1176"/>
-          </w:tcPr>
-          <w:p>
-            <w:pPr>
-              <w:keepNext/>
-            </w:pPr>
-            <w:r>
-              <w:rPr>
-                <w:sz w:val="16"/>
-              </w:rPr>
-              <w:t>98.7</w:t>
-            </w:r>
-          </w:p>
-        </w:tc>
-        <w:tc>
-          <w:tcPr>
-            <w:tcW w:type="dxa" w:w="1176"/>
-          </w:tcPr>
-          <w:p>
-            <w:pPr>
-              <w:keepNext/>
-            </w:pPr>
-            <w:r>
-              <w:rPr>
-                <w:sz w:val="16"/>
-              </w:rPr>
-              <w:t>0.07</w:t>
-            </w:r>
-          </w:p>
-        </w:tc>
-        <w:tc>
-          <w:tcPr>
-            <w:tcW w:type="dxa" w:w="1176"/>
-          </w:tcPr>
-          <w:p>
-            <w:pPr>
-              <w:keepNext/>
-            </w:pPr>
-            <w:r>
-              <w:rPr>
-                <w:sz w:val="16"/>
-              </w:rPr>
-              <w:t>0.06</w:t>
-            </w:r>
-          </w:p>
-        </w:tc>
-        <w:tc>
-          <w:tcPr>
-            <w:tcW w:type="dxa" w:w="1176"/>
-          </w:tcPr>
-          <w:p>
-            <w:pPr>
-              <w:keepNext/>
-            </w:pPr>
-            <w:r>
-              <w:rPr>
-                <w:sz w:val="16"/>
-              </w:rPr>
-              <w:t>0.19</w:t>
-            </w:r>
-          </w:p>
-        </w:tc>
-        <w:tc>
-          <w:tcPr>
-            <w:tcW w:type="dxa" w:w="1176"/>
-          </w:tcPr>
-          <w:p>
-            <w:pPr>
-              <w:keepNext/>
-            </w:pPr>
-            <w:r>
-              <w:rPr>
-                <w:sz w:val="16"/>
-              </w:rPr>
-              <w:t>2.0</w:t>
-            </w:r>
-          </w:p>
-        </w:tc>
-        <w:tc>
-          <w:tcPr>
-            <w:tcW w:type="dxa" w:w="1176"/>
-          </w:tcPr>
-          <w:p>
-            <w:pPr>
-              <w:keepNext/>
-            </w:pPr>
-            <w:r>
-              <w:rPr>
-                <w:sz w:val="16"/>
-              </w:rPr>
-              <w:t>Complies</w:t>
-            </w:r>
-          </w:p>
-        </w:tc>
-      </w:tr>
-      <w:tr>
-        <w:tc>
-          <w:tcPr>
-            <w:tcW w:type="dxa" w:w="1176"/>
-          </w:tcPr>
-          <w:p>
-            <w:pPr>
-              <w:keepNext/>
-            </w:pPr>
-            <w:r>
-              <w:rPr>
-                <w:sz w:val="16"/>
-              </w:rPr>
-              <w:t>25 °C/60% RH</w:t>
-            </w:r>
-          </w:p>
-        </w:tc>
-        <w:tc>
-          <w:tcPr>
-            <w:tcW w:type="dxa" w:w="1176"/>
-          </w:tcPr>
-          <w:p>
-            <w:pPr>
-              <w:keepNext/>
-            </w:pPr>
-            <w:r>
-              <w:rPr>
-                <w:sz w:val="16"/>
-              </w:rPr>
-              <w:t>6</w:t>
-            </w:r>
-          </w:p>
-        </w:tc>
-        <w:tc>
-          <w:tcPr>
-            <w:tcW w:type="dxa" w:w="1176"/>
-          </w:tcPr>
-          <w:p>
-            <w:pPr>
-              <w:keepNext/>
-            </w:pPr>
-            <w:r>
-              <w:rPr>
-                <w:sz w:val="16"/>
-              </w:rPr>
-              <w:t>99.1</w:t>
-            </w:r>
-          </w:p>
-        </w:tc>
-        <w:tc>
-          <w:tcPr>
-            <w:tcW w:type="dxa" w:w="1176"/>
-          </w:tcPr>
-          <w:p>
-            <w:pPr>
-              <w:keepNext/>
-            </w:pPr>
-            <w:r>
-              <w:rPr>
-                <w:sz w:val="16"/>
-              </w:rPr>
-              <w:t>0.11</w:t>
-            </w:r>
-          </w:p>
-        </w:tc>
-        <w:tc>
-          <w:tcPr>
-            <w:tcW w:type="dxa" w:w="1176"/>
-          </w:tcPr>
-          <w:p>
-            <w:pPr>
-              <w:keepNext/>
-            </w:pPr>
-            <w:r>
-              <w:rPr>
-                <w:sz w:val="16"/>
-              </w:rPr>
-              <w:t>0.06</w:t>
-            </w:r>
-          </w:p>
-        </w:tc>
-        <w:tc>
-          <w:tcPr>
-            <w:tcW w:type="dxa" w:w="1176"/>
-          </w:tcPr>
-          <w:p>
-            <w:pPr>
-              <w:keepNext/>
-            </w:pPr>
-            <w:r>
-              <w:rPr>
-                <w:sz w:val="16"/>
-              </w:rPr>
-              <w:t>0.32</w:t>
-            </w:r>
-          </w:p>
-        </w:tc>
-        <w:tc>
-          <w:tcPr>
-            <w:tcW w:type="dxa" w:w="1176"/>
-          </w:tcPr>
-          <w:p>
-            <w:pPr>
-              <w:keepNext/>
-            </w:pPr>
-            <w:r>
-              <w:rPr>
-                <w:sz w:val="16"/>
-              </w:rPr>
-              <w:t>1.2</w:t>
-            </w:r>
-          </w:p>
-        </w:tc>
-        <w:tc>
-          <w:tcPr>
-            <w:tcW w:type="dxa" w:w="1176"/>
-          </w:tcPr>
-          <w:p>
-            <w:pPr>
-              <w:keepNext/>
-            </w:pPr>
-            <w:r>
-              <w:rPr>
-                <w:sz w:val="16"/>
-              </w:rPr>
-              <w:t>Complies</w:t>
-            </w:r>
-          </w:p>
-        </w:tc>
-      </w:tr>
-      <w:tr>
-        <w:tc>
-          <w:tcPr>
-            <w:tcW w:type="dxa" w:w="1176"/>
-          </w:tcPr>
-          <w:p>
-            <w:pPr>
-              <w:keepNext/>
-            </w:pPr>
-            <w:r>
-              <w:rPr>
-                <w:sz w:val="16"/>
-              </w:rPr>
               <w:t>30 °C/65% RH</w:t>
             </w:r>
           </w:p>
@@ -937,786 +547,6 @@
             <w:tcW w:type="dxa" w:w="1176"/>
           </w:tcPr>
           <w:p>
-            <w:pPr>
-              <w:keepNext/>
-            </w:pPr>
-            <w:r>
-              <w:rPr>
-                <w:sz w:val="16"/>
-              </w:rPr>
-              <w:t>30 °C/65% RH</w:t>
-            </w:r>
-          </w:p>
-        </w:tc>
-        <w:tc>
-          <w:tcPr>
-            <w:tcW w:type="dxa" w:w="1176"/>
-          </w:tcPr>
-          <w:p>
-            <w:pPr>
-              <w:keepNext/>
-            </w:pPr>
-            <w:r>
-              <w:rPr>
-                <w:sz w:val="16"/>
-              </w:rPr>
-              <w:t>1</w:t>
-            </w:r>
-          </w:p>
-        </w:tc>
-        <w:tc>
-          <w:tcPr>
-            <w:tcW w:type="dxa" w:w="1176"/>
-          </w:tcPr>
-          <w:p>
-            <w:pPr>
-              <w:keepNext/>
-            </w:pPr>
-            <w:r>
-              <w:rPr>
-                <w:sz w:val="16"/>
-              </w:rPr>
-              <w:t>99.3</w:t>
-            </w:r>
-          </w:p>
-        </w:tc>
-        <w:tc>
-          <w:tcPr>
-            <w:tcW w:type="dxa" w:w="1176"/>
-          </w:tcPr>
-          <w:p>
-            <w:pPr>
-              <w:keepNext/>
-            </w:pPr>
-            <w:r>
-              <w:rPr>
-                <w:sz w:val="16"/>
-              </w:rPr>
-              <w:t>0.05</w:t>
-            </w:r>
-          </w:p>
-        </w:tc>
-        <w:tc>
-          <w:tcPr>
-            <w:tcW w:type="dxa" w:w="1176"/>
-          </w:tcPr>
-          <w:p>
-            <w:pPr>
-              <w:keepNext/>
-            </w:pPr>
-            <w:r>
-              <w:rPr>
-                <w:sz w:val="16"/>
-              </w:rPr>
-              <w:t>&lt;0.05</w:t>
-            </w:r>
-          </w:p>
-        </w:tc>
-        <w:tc>
-          <w:tcPr>
-            <w:tcW w:type="dxa" w:w="1176"/>
-          </w:tcPr>
-          <w:p>
-            <w:pPr>
-              <w:keepNext/>
-            </w:pPr>
-            <w:r>
-              <w:rPr>
-                <w:sz w:val="16"/>
-              </w:rPr>
-              <w:t>0.21</w:t>
-            </w:r>
-          </w:p>
-        </w:tc>
-        <w:tc>
-          <w:tcPr>
-            <w:tcW w:type="dxa" w:w="1176"/>
-          </w:tcPr>
-          <w:p>
-            <w:pPr>
-              <w:keepNext/>
-            </w:pPr>
-            <w:r>
-              <w:rPr>
-                <w:sz w:val="16"/>
-              </w:rPr>
-              <w:t>0.9</w:t>
-            </w:r>
-          </w:p>
-        </w:tc>
-        <w:tc>
-          <w:tcPr>
-            <w:tcW w:type="dxa" w:w="1176"/>
-          </w:tcPr>
-          <w:p>
-            <w:pPr>
-              <w:keepNext/>
-            </w:pPr>
-            <w:r>
-              <w:rPr>
-                <w:sz w:val="16"/>
-              </w:rPr>
-              <w:t>Complies</w:t>
-            </w:r>
-          </w:p>
-        </w:tc>
-      </w:tr>
-      <w:tr>
-        <w:tc>
-          <w:tcPr>
-            <w:tcW w:type="dxa" w:w="1176"/>
-          </w:tcPr>
-          <w:p>
-            <w:pPr>
-              <w:keepNext/>
-            </w:pPr>
-            <w:r>
-              <w:rPr>
-                <w:sz w:val="16"/>
-              </w:rPr>
-              <w:t>30 °C/65% RH</w:t>
-            </w:r>
-          </w:p>
-        </w:tc>
-        <w:tc>
-          <w:tcPr>
-            <w:tcW w:type="dxa" w:w="1176"/>
-          </w:tcPr>
-          <w:p>
-            <w:pPr>
-              <w:keepNext/>
-            </w:pPr>
-            <w:r>
-              <w:rPr>
-                <w:sz w:val="16"/>
-              </w:rPr>
-              <w:t>3</w:t>
-            </w:r>
-          </w:p>
-        </w:tc>
-        <w:tc>
-          <w:tcPr>
-            <w:tcW w:type="dxa" w:w="1176"/>
-          </w:tcPr>
-          <w:p>
-            <w:pPr>
-              <w:keepNext/>
-            </w:pPr>
-            <w:r>
-              <w:rPr>
-                <w:sz w:val="16"/>
-              </w:rPr>
-              <w:t>99.0</w:t>
-            </w:r>
-          </w:p>
-        </w:tc>
-        <w:tc>
-          <w:tcPr>
-            <w:tcW w:type="dxa" w:w="1176"/>
-          </w:tcPr>
-          <w:p>
-            <w:pPr>
-              <w:keepNext/>
-            </w:pPr>
-            <w:r>
-              <w:rPr>
-                <w:sz w:val="16"/>
-              </w:rPr>
-              <w:t>0.10</w:t>
-            </w:r>
-          </w:p>
-        </w:tc>
-        <w:tc>
-          <w:tcPr>
-            <w:tcW w:type="dxa" w:w="1176"/>
-          </w:tcPr>
-          <w:p>
-            <w:pPr>
-              <w:keepNext/>
-            </w:pPr>
-            <w:r>
-              <w:rPr>
-                <w:sz w:val="16"/>
-              </w:rPr>
-              <w:t>&lt;0.05</w:t>
-            </w:r>
-          </w:p>
-        </w:tc>
-        <w:tc>
-          <w:tcPr>
-            <w:tcW w:type="dxa" w:w="1176"/>
-          </w:tcPr>
-          <w:p>
-            <w:pPr>
-              <w:keepNext/>
-            </w:pPr>
-            <w:r>
-              <w:rPr>
-                <w:sz w:val="16"/>
-              </w:rPr>
-              <w:t>0.23</w:t>
-            </w:r>
-          </w:p>
-        </w:tc>
-        <w:tc>
-          <w:tcPr>
-            <w:tcW w:type="dxa" w:w="1176"/>
-          </w:tcPr>
-          <w:p>
-            <w:pPr>
-              <w:keepNext/>
-            </w:pPr>
-            <w:r>
-              <w:rPr>
-                <w:sz w:val="16"/>
-              </w:rPr>
-              <w:t>1.7</w:t>
-            </w:r>
-          </w:p>
-        </w:tc>
-        <w:tc>
-          <w:tcPr>
-            <w:tcW w:type="dxa" w:w="1176"/>
-          </w:tcPr>
-          <w:p>
-            <w:pPr>
-              <w:keepNext/>
-            </w:pPr>
-            <w:r>
-              <w:rPr>
-                <w:sz w:val="16"/>
-              </w:rPr>
-              <w:t>Complies</w:t>
-            </w:r>
-          </w:p>
-        </w:tc>
-      </w:tr>
-      <w:tr>
-        <w:tc>
-          <w:tcPr>
-            <w:tcW w:type="dxa" w:w="1176"/>
-          </w:tcPr>
-          <w:p>
-            <w:pPr>
-              <w:keepNext/>
-            </w:pPr>
-            <w:r>
-              <w:rPr>
-                <w:sz w:val="16"/>
-              </w:rPr>
-              <w:t>30 °C/65% RH</w:t>
-            </w:r>
-          </w:p>
-        </w:tc>
-        <w:tc>
-          <w:tcPr>
-            <w:tcW w:type="dxa" w:w="1176"/>
-          </w:tcPr>
-          <w:p>
-            <w:pPr>
-              <w:keepNext/>
-            </w:pPr>
-            <w:r>
-              <w:rPr>
-                <w:sz w:val="16"/>
-              </w:rPr>
-              <w:t>6</w:t>
-            </w:r>
-          </w:p>
-        </w:tc>
-        <w:tc>
-          <w:tcPr>
-            <w:tcW w:type="dxa" w:w="1176"/>
-          </w:tcPr>
-          <w:p>
-            <w:pPr>
-              <w:keepNext/>
-            </w:pPr>
-            <w:r>
-              <w:rPr>
-                <w:sz w:val="16"/>
-              </w:rPr>
-              <w:t>98.9</w:t>
-            </w:r>
-          </w:p>
-        </w:tc>
-        <w:tc>
-          <w:tcPr>
-            <w:tcW w:type="dxa" w:w="1176"/>
-          </w:tcPr>
-          <w:p>
-            <w:pPr>
-              <w:keepNext/>
-            </w:pPr>
-            <w:r>
-              <w:rPr>
-                <w:sz w:val="16"/>
-              </w:rPr>
-              <w:t>0.14</w:t>
-            </w:r>
-          </w:p>
-        </w:tc>
-        <w:tc>
-          <w:tcPr>
-            <w:tcW w:type="dxa" w:w="1176"/>
-          </w:tcPr>
-          <w:p>
-            <w:pPr>
-              <w:keepNext/>
-            </w:pPr>
-            <w:r>
-              <w:rPr>
-                <w:sz w:val="16"/>
-              </w:rPr>
-              <w:t>0.07</w:t>
-            </w:r>
-          </w:p>
-        </w:tc>
-        <w:tc>
-          <w:tcPr>
-            <w:tcW w:type="dxa" w:w="1176"/>
-          </w:tcPr>
-          <w:p>
-            <w:pPr>
-              <w:keepNext/>
-            </w:pPr>
-            <w:r>
-              <w:rPr>
-                <w:sz w:val="16"/>
-              </w:rPr>
-              <w:t>0.31</w:t>
-            </w:r>
-          </w:p>
-        </w:tc>
-        <w:tc>
-          <w:tcPr>
-            <w:tcW w:type="dxa" w:w="1176"/>
-          </w:tcPr>
-          <w:p>
-            <w:pPr>
-              <w:keepNext/>
-            </w:pPr>
-            <w:r>
-              <w:rPr>
-                <w:sz w:val="16"/>
-              </w:rPr>
-              <w:t>2.1</w:t>
-            </w:r>
-          </w:p>
-        </w:tc>
-        <w:tc>
-          <w:tcPr>
-            <w:tcW w:type="dxa" w:w="1176"/>
-          </w:tcPr>
-          <w:p>
-            <w:pPr>
-              <w:keepNext/>
-            </w:pPr>
-            <w:r>
-              <w:rPr>
-                <w:sz w:val="16"/>
-              </w:rPr>
-              <w:t>Complies</w:t>
-            </w:r>
-          </w:p>
-        </w:tc>
-      </w:tr>
-      <w:tr>
-        <w:tc>
-          <w:tcPr>
-            <w:tcW w:type="dxa" w:w="1176"/>
-          </w:tcPr>
-          <w:p>
-            <w:pPr>
-              <w:keepNext/>
-            </w:pPr>
-            <w:r>
-              <w:rPr>
-                <w:sz w:val="16"/>
-              </w:rPr>
-              <w:t>40 °C/75% RH</w:t>
-            </w:r>
-          </w:p>
-        </w:tc>
-        <w:tc>
-          <w:tcPr>
-            <w:tcW w:type="dxa" w:w="1176"/>
-          </w:tcPr>
-          <w:p>
-            <w:pPr>
-              <w:keepNext/>
-            </w:pPr>
-            <w:r>
-              <w:rPr>
-                <w:sz w:val="16"/>
-              </w:rPr>
-              <w:t>0</w:t>
-            </w:r>
-          </w:p>
-        </w:tc>
-        <w:tc>
-          <w:tcPr>
-            <w:tcW w:type="dxa" w:w="1176"/>
-          </w:tcPr>
-          <w:p>
-            <w:pPr>
-              <w:keepNext/>
-            </w:pPr>
-            <w:r>
-              <w:rPr>
-                <w:sz w:val="16"/>
-              </w:rPr>
-              <w:t>99.2</w:t>
-            </w:r>
-          </w:p>
-        </w:tc>
-        <w:tc>
-          <w:tcPr>
-            <w:tcW w:type="dxa" w:w="1176"/>
-          </w:tcPr>
-          <w:p>
-            <w:pPr>
-              <w:keepNext/>
-            </w:pPr>
-            <w:r>
-              <w:rPr>
-                <w:sz w:val="16"/>
-              </w:rPr>
-              <w:t>0.06</w:t>
-            </w:r>
-          </w:p>
-        </w:tc>
-        <w:tc>
-          <w:tcPr>
-            <w:tcW w:type="dxa" w:w="1176"/>
-          </w:tcPr>
-          <w:p>
-            <w:pPr>
-              <w:keepNext/>
-            </w:pPr>
-            <w:r>
-              <w:rPr>
-                <w:sz w:val="16"/>
-              </w:rPr>
-              <w:t>&lt;0.05</w:t>
-            </w:r>
-          </w:p>
-        </w:tc>
-        <w:tc>
-          <w:tcPr>
-            <w:tcW w:type="dxa" w:w="1176"/>
-          </w:tcPr>
-          <w:p>
-            <w:pPr>
-              <w:keepNext/>
-            </w:pPr>
-            <w:r>
-              <w:rPr>
-                <w:sz w:val="16"/>
-              </w:rPr>
-              <w:t>0.22</w:t>
-            </w:r>
-          </w:p>
-        </w:tc>
-        <w:tc>
-          <w:tcPr>
-            <w:tcW w:type="dxa" w:w="1176"/>
-          </w:tcPr>
-          <w:p>
-            <w:pPr>
-              <w:keepNext/>
-            </w:pPr>
-            <w:r>
-              <w:rPr>
-                <w:sz w:val="16"/>
-              </w:rPr>
-              <w:t>2.1</w:t>
-            </w:r>
-          </w:p>
-        </w:tc>
-        <w:tc>
-          <w:tcPr>
-            <w:tcW w:type="dxa" w:w="1176"/>
-          </w:tcPr>
-          <w:p>
-            <w:pPr>
-              <w:keepNext/>
-            </w:pPr>
-            <w:r>
-              <w:rPr>
-                <w:sz w:val="16"/>
-              </w:rPr>
-              <w:t>Complies</w:t>
-            </w:r>
-          </w:p>
-        </w:tc>
-      </w:tr>
-      <w:tr>
-        <w:tc>
-          <w:tcPr>
-            <w:tcW w:type="dxa" w:w="1176"/>
-          </w:tcPr>
-          <w:p>
-            <w:pPr>
-              <w:keepNext/>
-            </w:pPr>
-            <w:r>
-              <w:rPr>
-                <w:sz w:val="16"/>
-              </w:rPr>
-              <w:t>40 °C/75% RH</w:t>
-            </w:r>
-          </w:p>
-        </w:tc>
-        <w:tc>
-          <w:tcPr>
-            <w:tcW w:type="dxa" w:w="1176"/>
-          </w:tcPr>
-          <w:p>
-            <w:pPr>
-              <w:keepNext/>
-            </w:pPr>
-            <w:r>
-              <w:rPr>
-                <w:sz w:val="16"/>
-              </w:rPr>
-              <w:t>1</w:t>
-            </w:r>
-          </w:p>
-        </w:tc>
-        <w:tc>
-          <w:tcPr>
-            <w:tcW w:type="dxa" w:w="1176"/>
-          </w:tcPr>
-          <w:p>
-            <w:pPr>
-              <w:keepNext/>
-            </w:pPr>
-            <w:r>
-              <w:rPr>
-                <w:sz w:val="16"/>
-              </w:rPr>
-              <w:t>99.0</w:t>
-            </w:r>
-          </w:p>
-        </w:tc>
-        <w:tc>
-          <w:tcPr>
-            <w:tcW w:type="dxa" w:w="1176"/>
-          </w:tcPr>
-          <w:p>
-            <w:pPr>
-              <w:keepNext/>
-            </w:pPr>
-            <w:r>
-              <w:rPr>
-                <w:sz w:val="16"/>
-              </w:rPr>
-              <w:t>0.09</w:t>
-            </w:r>
-          </w:p>
-        </w:tc>
-        <w:tc>
-          <w:tcPr>
-            <w:tcW w:type="dxa" w:w="1176"/>
-          </w:tcPr>
-          <w:p>
-            <w:pPr>
-              <w:keepNext/>
-            </w:pPr>
-            <w:r>
-              <w:rPr>
-                <w:sz w:val="16"/>
-              </w:rPr>
-              <w:t>&lt;0.05</w:t>
-            </w:r>
-          </w:p>
-        </w:tc>
-        <w:tc>
-          <w:tcPr>
-            <w:tcW w:type="dxa" w:w="1176"/>
-          </w:tcPr>
-          <w:p>
-            <w:pPr>
-              <w:keepNext/>
-            </w:pPr>
-            <w:r>
-              <w:rPr>
-                <w:sz w:val="16"/>
-              </w:rPr>
-              <w:t>0.25</w:t>
-            </w:r>
-          </w:p>
-        </w:tc>
-        <w:tc>
-          <w:tcPr>
-            <w:tcW w:type="dxa" w:w="1176"/>
-          </w:tcPr>
-          <w:p>
-            <w:pPr>
-              <w:keepNext/>
-            </w:pPr>
-            <w:r>
-              <w:rPr>
-                <w:sz w:val="16"/>
-              </w:rPr>
-              <w:t>0.8</w:t>
-            </w:r>
-          </w:p>
-        </w:tc>
-        <w:tc>
-          <w:tcPr>
-            <w:tcW w:type="dxa" w:w="1176"/>
-          </w:tcPr>
-          <w:p>
-            <w:pPr>
-              <w:keepNext/>
-            </w:pPr>
-            <w:r>
-              <w:rPr>
-                <w:sz w:val="16"/>
-              </w:rPr>
-              <w:t>Complies</w:t>
-            </w:r>
-          </w:p>
-        </w:tc>
-      </w:tr>
-      <w:tr>
-        <w:tc>
-          <w:tcPr>
-            <w:tcW w:type="dxa" w:w="1176"/>
-          </w:tcPr>
-          <w:p>
-            <w:pPr>
-              <w:keepNext/>
-            </w:pPr>
-            <w:r>
-              <w:rPr>
-                <w:sz w:val="16"/>
-              </w:rPr>
-              <w:t>40 °C/75% RH</w:t>
-            </w:r>
-          </w:p>
-        </w:tc>
-        <w:tc>
-          <w:tcPr>
-            <w:tcW w:type="dxa" w:w="1176"/>
-          </w:tcPr>
-          <w:p>
-            <w:pPr>
-              <w:keepNext/>
-            </w:pPr>
-            <w:r>
-              <w:rPr>
-                <w:sz w:val="16"/>
-              </w:rPr>
-              <w:t>3</w:t>
-            </w:r>
-          </w:p>
-        </w:tc>
-        <w:tc>
-          <w:tcPr>
-            <w:tcW w:type="dxa" w:w="1176"/>
-          </w:tcPr>
-          <w:p>
-            <w:pPr>
-              <w:keepNext/>
-            </w:pPr>
-            <w:r>
-              <w:rPr>
-                <w:sz w:val="16"/>
-              </w:rPr>
-              <w:t>98.8</w:t>
-            </w:r>
-          </w:p>
-        </w:tc>
-        <w:tc>
-          <w:tcPr>
-            <w:tcW w:type="dxa" w:w="1176"/>
-          </w:tcPr>
-          <w:p>
-            <w:pPr>
-              <w:keepNext/>
-            </w:pPr>
-            <w:r>
-              <w:rPr>
-                <w:sz w:val="16"/>
-              </w:rPr>
-              <w:t>0.20</w:t>
-            </w:r>
-          </w:p>
-        </w:tc>
-        <w:tc>
-          <w:tcPr>
-            <w:tcW w:type="dxa" w:w="1176"/>
-          </w:tcPr>
-          <w:p>
-            <w:pPr>
-              <w:keepNext/>
-            </w:pPr>
-            <w:r>
-              <w:rPr>
-                <w:sz w:val="16"/>
-              </w:rPr>
-              <w:t>0.11</w:t>
-            </w:r>
-          </w:p>
-        </w:tc>
-        <w:tc>
-          <w:tcPr>
-            <w:tcW w:type="dxa" w:w="1176"/>
-          </w:tcPr>
-          <w:p>
-            <w:pPr>
-              <w:keepNext/>
-            </w:pPr>
-            <w:r>
-              <w:rPr>
-                <w:sz w:val="16"/>
-              </w:rPr>
-              <w:t>0.40</w:t>
-            </w:r>
-          </w:p>
-        </w:tc>
-        <w:tc>
-          <w:tcPr>
-            <w:tcW w:type="dxa" w:w="1176"/>
-          </w:tcPr>
-          <w:p>
-            <w:pPr>
-              <w:keepNext/>
-            </w:pPr>
-            <w:r>
-              <w:rPr>
-                <w:sz w:val="16"/>
-              </w:rPr>
-              <w:t>2.4</w:t>
-            </w:r>
-          </w:p>
-        </w:tc>
-        <w:tc>
-          <w:tcPr>
-            <w:tcW w:type="dxa" w:w="1176"/>
-          </w:tcPr>
-          <w:p>
-            <w:pPr>
-              <w:keepNext/>
-            </w:pPr>
-            <w:r>
-              <w:rPr>
-                <w:sz w:val="16"/>
-              </w:rPr>
-              <w:t>Complies</w:t>
-            </w:r>
-          </w:p>
-        </w:tc>
-      </w:tr>
-      <w:tr>
-        <w:tc>
-          <w:tcPr>
-            <w:tcW w:type="dxa" w:w="1176"/>
-          </w:tcPr>
-          <w:p>
             <w:r>
               <w:rPr>
                 <w:sz w:val="16"/>
@@ -1734,7 +564,7 @@
               <w:rPr>
                 <w:sz w:val="16"/>
               </w:rPr>
-              <w:t>6</w:t>
+              <w:t>0</w:t>
             </w:r>
           </w:p>
         </w:tc>
@@ -1747,7 +577,7 @@
               <w:rPr>
                 <w:sz w:val="16"/>
               </w:rPr>
-              <w:t>97.8</w:t>
+              <w:t>99.2</w:t>
             </w:r>
           </w:p>
         </w:tc>
@@ -1760,7 +590,7 @@
               <w:rPr>
                 <w:sz w:val="16"/>
               </w:rPr>
-              <w:t>0.35</w:t>
+              <w:t>0.06</w:t>
             </w:r>
           </w:p>
         </w:tc>
@@ -1773,7 +603,7 @@
               <w:rPr>
                 <w:sz w:val="16"/>
               </w:rPr>
-              <w:t>0.21</w:t>
+              <w:t>&lt;0.05</w:t>
             </w:r>
           </w:p>
         </w:tc>
@@ -1786,7 +616,7 @@
               <w:rPr>
                 <w:sz w:val="16"/>
               </w:rPr>
-              <w:t>0.61</w:t>
+              <w:t>0.22</w:t>
             </w:r>
           </w:p>
         </w:tc>
@@ -1799,7 +629,7 @@
               <w:rPr>
                 <w:sz w:val="16"/>
               </w:rPr>
-              <w:t>1.3</w:t>
+              <w:t>2.1</w:t>
             </w:r>
           </w:p>
         </w:tc>
@@ -2298,7 +1128,7 @@
 
 <file path=word/comments.xml><?xml version="1.0" encoding="utf-8"?>
 <w:comments xmlns:a="http://schemas.openxmlformats.org/drawingml/2006/main" xmlns:pic="http://schemas.openxmlformats.org/drawingml/2006/picture" xmlns:r="http://schemas.openxmlformats.org/officeDocument/2006/relationships" xmlns:w="http://schemas.openxmlformats.org/wordprocessingml/2006/main" xmlns:wp="http://schemas.openxmlformats.org/drawingml/2006/wordprocessingDrawing" xmlns:mc="http://schemas.openxmlformats.org/markup-compatibility/2006" xmlns:a14="http://schemas.microsoft.com/office/drawing/2010/main" xmlns:w14="http://schemas.microsoft.com/office/word/2010/wordml" xmlns:wpc="http://schemas.microsoft.com/office/word/2010/wordprocessingCanvas">
-  <w:comment w:id="0" w:author="Alice Penrose" w:initials="AP" w:date="2026-10-08T15:14:30Z">
+  <w:comment w:id="0" w:author="Alice Penrose" w:initials="AP" w:date="2026-10-08T15:19:05Z">
     <w:p>
       <w:pPr>
         <w:pStyle w:val="CommentText"/>
@@ -2314,7 +1144,7 @@
       </w:r>
     </w:p>
   </w:comment>
-  <w:comment w:id="1" w:author="Saira Mahmood" w:initials="SM" w:date="2026-10-08T15:14:30Z">
+  <w:comment w:id="1" w:author="Saira Mahmood" w:initials="SM" w:date="2026-10-08T15:19:05Z">
     <w:p>
       <w:pPr>
         <w:pStyle w:val="CommentText"/>

</xml_diff>

<commit_message>
E-044: text matches initial-only stability data
</commit_message>
<xml_diff>
--- a/output/archive/WestravelleData/Stability/QP07/WA-2025-407/Deviation_Notes/Hold/WA-2025-407_QP07_HOLD_NOTE_Rev01.docx
+++ b/output/archive/WestravelleData/Stability/QP07/WA-2025-407/Deviation_Notes/Hold/WA-2025-407_QP07_HOLD_NOTE_Rev01.docx
@@ -96,7 +96,7 @@
     </w:p>
     <w:p>
       <w:r>
-        <w:t>Table 1 gives the results for all pulls generated to date. Every pull is marked Complies against the specification. Assay (% label claim) started at 99.2 and stayed within the specification at all three conditions. The largest change is at 40 °C/75% RH, where total impurities rise steadily with time and the assay at the last pull is the lowest in the set.</w:t>
+        <w:t>Table 1 gives the initial (time-zero) results placed at all three conditions; every result complies with the specification, with assay at 99.2% label claim. New pulls were suspended before the first scheduled timepoint, so no trend with time can be assessed yet.</w:t>
       </w:r>
     </w:p>
     <w:p>
@@ -1128,7 +1128,7 @@
 
 <file path=word/comments.xml><?xml version="1.0" encoding="utf-8"?>
 <w:comments xmlns:a="http://schemas.openxmlformats.org/drawingml/2006/main" xmlns:pic="http://schemas.openxmlformats.org/drawingml/2006/picture" xmlns:r="http://schemas.openxmlformats.org/officeDocument/2006/relationships" xmlns:w="http://schemas.openxmlformats.org/wordprocessingml/2006/main" xmlns:wp="http://schemas.openxmlformats.org/drawingml/2006/wordprocessingDrawing" xmlns:mc="http://schemas.openxmlformats.org/markup-compatibility/2006" xmlns:a14="http://schemas.microsoft.com/office/drawing/2010/main" xmlns:w14="http://schemas.microsoft.com/office/word/2010/wordml" xmlns:wpc="http://schemas.microsoft.com/office/word/2010/wordprocessingCanvas">
-  <w:comment w:id="0" w:author="Alice Penrose" w:initials="AP" w:date="2026-10-08T15:19:05Z">
+  <w:comment w:id="0" w:author="Alice Penrose" w:initials="AP" w:date="2026-10-08T15:19:15Z">
     <w:p>
       <w:pPr>
         <w:pStyle w:val="CommentText"/>
@@ -1144,7 +1144,7 @@
       </w:r>
     </w:p>
   </w:comment>
-  <w:comment w:id="1" w:author="Saira Mahmood" w:initials="SM" w:date="2026-10-08T15:19:05Z">
+  <w:comment w:id="1" w:author="Saira Mahmood" w:initials="SM" w:date="2026-10-08T15:19:15Z">
     <w:p>
       <w:pPr>
         <w:pStyle w:val="CommentText"/>

</xml_diff>

<commit_message>
E-044: remove trend statements
</commit_message>
<xml_diff>
--- a/output/archive/WestravelleData/Stability/QP07/WA-2025-407/Deviation_Notes/Hold/WA-2025-407_QP07_HOLD_NOTE_Rev01.docx
+++ b/output/archive/WestravelleData/Stability/QP07/WA-2025-407/Deviation_Notes/Hold/WA-2025-407_QP07_HOLD_NOTE_Rev01.docx
@@ -663,7 +663,7 @@
         <w:rPr>
           <w:sz w:val="17"/>
         </w:rPr>
-        <w:t>At 25 °C/60% RH and 30 °C/65% RH total impurities stay low and change little up to 3 months, with a small rise at 6 months. Imp B RRT 1.12 is below the reporting limit at both conditions until the 6-month pull. Water KF values move between pulls without a trend and are not treated as a stability signal on their own.</w:t>
+        <w:t>Imp B RRT 1.12 is below the reporting limit in the initial analysis, and water (KF) is within the expected range for the blend. The samples placed at 1, 3 and 6 months remain in chamber and have not been pulled.</w:t>
       </w:r>
     </w:p>
     <w:p>
@@ -1128,7 +1128,7 @@
 
 <file path=word/comments.xml><?xml version="1.0" encoding="utf-8"?>
 <w:comments xmlns:a="http://schemas.openxmlformats.org/drawingml/2006/main" xmlns:pic="http://schemas.openxmlformats.org/drawingml/2006/picture" xmlns:r="http://schemas.openxmlformats.org/officeDocument/2006/relationships" xmlns:w="http://schemas.openxmlformats.org/wordprocessingml/2006/main" xmlns:wp="http://schemas.openxmlformats.org/drawingml/2006/wordprocessingDrawing" xmlns:mc="http://schemas.openxmlformats.org/markup-compatibility/2006" xmlns:a14="http://schemas.microsoft.com/office/drawing/2010/main" xmlns:w14="http://schemas.microsoft.com/office/word/2010/wordml" xmlns:wpc="http://schemas.microsoft.com/office/word/2010/wordprocessingCanvas">
-  <w:comment w:id="0" w:author="Alice Penrose" w:initials="AP" w:date="2026-10-08T15:19:15Z">
+  <w:comment w:id="0" w:author="Alice Penrose" w:initials="AP" w:date="2026-10-08T15:20:32Z">
     <w:p>
       <w:pPr>
         <w:pStyle w:val="CommentText"/>
@@ -1144,7 +1144,7 @@
       </w:r>
     </w:p>
   </w:comment>
-  <w:comment w:id="1" w:author="Saira Mahmood" w:initials="SM" w:date="2026-10-08T15:19:15Z">
+  <w:comment w:id="1" w:author="Saira Mahmood" w:initials="SM" w:date="2026-10-08T15:20:32Z">
     <w:p>
       <w:pPr>
         <w:pStyle w:val="CommentText"/>

</xml_diff>

<commit_message>
Stage 8 review fixes: E-044
</commit_message>
<xml_diff>
--- a/output/archive/WestravelleData/Stability/QP07/WA-2025-407/Deviation_Notes/Hold/WA-2025-407_QP07_HOLD_NOTE_Rev01.docx
+++ b/output/archive/WestravelleData/Stability/QP07/WA-2025-407/Deviation_Notes/Hold/WA-2025-407_QP07_HOLD_NOTE_Rev01.docx
@@ -27,6 +27,11 @@
           <w:sz w:val="26"/>
         </w:rPr>
         <w:t>Deviation note, interim</w:t>
+      </w:r>
+    </w:p>
+    <w:p>
+      <w:r>
+        <w:t>Westravelle Analytical Ltd, a Tarnovell company</w:t>
       </w:r>
     </w:p>
     <w:p>
@@ -69,13 +74,13 @@
     </w:p>
     <w:p>
       <w:r>
-        <w:t>The stability programme for the QP07 clinical prototype runs under the ICH chamber programme at 25 °C/60% RH, 30 °C/65% RH and 40 °C/75% RH. The method validation for the assay and related substances was completed in the HPLC method qualification and is summarised in Table 2.</w:t>
+        <w:t>The QP07 clinical prototype entered the ICH chamber programme at 25 °C/60% RH, 30 °C/65% RH and 40 °C/75% RH. Table 2 records the available HPLC method qualification checks; full validation and transfer conclusions remain pending.</w:t>
       </w:r>
     </w:p>
     <w:p>
       <w:commentRangeStart w:id="0"/>
       <w:r>
-        <w:t>On the notification received from the client, the prototype composition is being changed and the current lot will not be used for the remaining pulls. New pulls were suspended from the date of the hold. Samples already in the chambers are retained under the storage conditions of the protocol.</w:t>
+        <w:t>On the notification received from the client, the prototype composition is being changed and instructions for further testing of the current lot remain unresolved. New pulls were suspended from the date of the hold. Samples already in the chambers are retained under the storage conditions of the protocol.</w:t>
       </w:r>
       <w:commentRangeEnd w:id="0"/>
       <w:r>
@@ -663,7 +668,7 @@
         <w:rPr>
           <w:sz w:val="17"/>
         </w:rPr>
-        <w:t>Imp B RRT 1.12 is below the reporting limit in the initial analysis, and water (KF) is within the expected range for the blend. The samples placed at 1, 3 and 6 months remain in chamber and have not been pulled.</w:t>
+        <w:t>Imp B RRT 1.12 is reported below the limit shown in Table 1. The table contains time-zero results only; there are no post-storage results to interpret. Existing chamber samples are retained pending instructions; the pull schedule is [TBC].</w:t>
       </w:r>
     </w:p>
     <w:p>
@@ -677,7 +682,7 @@
     </w:p>
     <w:p>
       <w:r>
-        <w:t>The HPLC method used for the assay and related substances met all the acceptance criteria in the validation summary in Table 2. [TBC: confirm whether the robustness study is complete before this note is issued as final.]</w:t>
+        <w:t>The linearity, range and accuracy checks shown in Table 2 meet their listed acceptance criteria. These checks do not establish complete assay and related-substances validation or method transfer. [TBC: confirm outstanding validation and transfer work, including robustness, before final issue.]</w:t>
       </w:r>
     </w:p>
     <w:p>
@@ -926,7 +931,7 @@
     <w:p>
       <w:commentRangeStart w:id="1"/>
       <w:r>
-        <w:t>Retained samples for the QP07 lot are held in the chamber file under the protocol storage conditions. The number of units in each chamber is XX pending a physical count at the next scheduled chamber check, and the count will be recorded against the batch card when it is done.</w:t>
+        <w:t>Retained samples for the QP07 lot are held in the chambers under the protocol storage conditions. The number of units in each chamber is XX pending a physical count at the next scheduled chamber check, and the count will be recorded against the batch card when it is done.</w:t>
       </w:r>
       <w:commentRangeEnd w:id="1"/>
       <w:r>
@@ -943,7 +948,7 @@
         <w:keepLines/>
       </w:pPr>
       <w:r>
-        <w:t>No new pulls to be placed until the client confirms the restart instruction in writing</w:t>
+        <w:t>No further stability pulls to be taken until the client confirms the restart instruction in writing</w:t>
       </w:r>
     </w:p>
     <w:p>
@@ -1128,7 +1133,7 @@
 
 <file path=word/comments.xml><?xml version="1.0" encoding="utf-8"?>
 <w:comments xmlns:a="http://schemas.openxmlformats.org/drawingml/2006/main" xmlns:pic="http://schemas.openxmlformats.org/drawingml/2006/picture" xmlns:r="http://schemas.openxmlformats.org/officeDocument/2006/relationships" xmlns:w="http://schemas.openxmlformats.org/wordprocessingml/2006/main" xmlns:wp="http://schemas.openxmlformats.org/drawingml/2006/wordprocessingDrawing" xmlns:mc="http://schemas.openxmlformats.org/markup-compatibility/2006" xmlns:a14="http://schemas.microsoft.com/office/drawing/2010/main" xmlns:w14="http://schemas.microsoft.com/office/word/2010/wordml" xmlns:wpc="http://schemas.microsoft.com/office/word/2010/wordprocessingCanvas">
-  <w:comment w:id="0" w:author="Alice Penrose" w:initials="AP" w:date="2026-10-08T15:20:32Z">
+  <w:comment w:id="0" w:author="Alice Penrose" w:initials="AP" w:date="2026-10-08T15:25:59Z">
     <w:p>
       <w:pPr>
         <w:pStyle w:val="CommentText"/>
@@ -1144,7 +1149,7 @@
       </w:r>
     </w:p>
   </w:comment>
-  <w:comment w:id="1" w:author="Saira Mahmood" w:initials="SM" w:date="2026-10-08T15:20:32Z">
+  <w:comment w:id="1" w:author="Saira Mahmood" w:initials="SM" w:date="2026-10-08T15:25:59Z">
     <w:p>
       <w:pPr>
         <w:pStyle w:val="CommentText"/>

</xml_diff>